<commit_message>
review assignment-04 before submit
</commit_message>
<xml_diff>
--- a/Assignment-04/Assignment4-Illustration.docx
+++ b/Assignment-04/Assignment4-Illustration.docx
@@ -336,27 +336,7 @@
           <w:sz w:val="24"/>
           <w:szCs w:val="24"/>
         </w:rPr>
-        <w:t xml:space="preserve">(Pseudo code only; </w:t>
-      </w:r>
-      <w:proofErr w:type="gramStart"/>
-      <w:r>
-        <w:rPr>
-          <w:rFonts w:ascii="Segoe UI" w:hAnsi="Segoe UI" w:cs="Segoe UI"/>
-          <w:color w:val="808080" w:themeColor="background1" w:themeShade="80"/>
-          <w:sz w:val="24"/>
-          <w:szCs w:val="24"/>
-        </w:rPr>
-        <w:t>show</w:t>
-      </w:r>
-      <w:proofErr w:type="gramEnd"/>
-      <w:r>
-        <w:rPr>
-          <w:rFonts w:ascii="Segoe UI" w:hAnsi="Segoe UI" w:cs="Segoe UI"/>
-          <w:color w:val="808080" w:themeColor="background1" w:themeShade="80"/>
-          <w:sz w:val="24"/>
-          <w:szCs w:val="24"/>
-        </w:rPr>
-        <w:t xml:space="preserve"> reducer method too.)</w:t>
+        <w:t>(Pseudo code only; show reducer method too.)</w:t>
       </w:r>
     </w:p>
     <w:p>
@@ -429,27 +409,7 @@
           <w:szCs w:val="24"/>
         </w:rPr>
         <w:tab/>
-        <w:t xml:space="preserve">method </w:t>
-      </w:r>
-      <w:proofErr w:type="gramStart"/>
-      <w:r>
-        <w:rPr>
-          <w:rFonts w:ascii="Segoe UI" w:hAnsi="Segoe UI" w:cs="Segoe UI"/>
-          <w:color w:val="0000CC"/>
-          <w:sz w:val="24"/>
-          <w:szCs w:val="24"/>
-        </w:rPr>
-        <w:t>setup(</w:t>
-      </w:r>
-      <w:proofErr w:type="gramEnd"/>
-      <w:r>
-        <w:rPr>
-          <w:rFonts w:ascii="Segoe UI" w:hAnsi="Segoe UI" w:cs="Segoe UI"/>
-          <w:color w:val="0000CC"/>
-          <w:sz w:val="24"/>
-          <w:szCs w:val="24"/>
-        </w:rPr>
-        <w:t>)</w:t>
+        <w:t>method setup()</w:t>
       </w:r>
     </w:p>
     <w:p>
@@ -519,27 +479,7 @@
           <w:szCs w:val="24"/>
         </w:rPr>
         <w:tab/>
-        <w:t xml:space="preserve">method </w:t>
-      </w:r>
-      <w:proofErr w:type="gramStart"/>
-      <w:r>
-        <w:rPr>
-          <w:rFonts w:ascii="Segoe UI" w:hAnsi="Segoe UI" w:cs="Segoe UI"/>
-          <w:color w:val="0000CC"/>
-          <w:sz w:val="24"/>
-          <w:szCs w:val="24"/>
-        </w:rPr>
-        <w:t>map(</w:t>
-      </w:r>
-      <w:proofErr w:type="gramEnd"/>
-      <w:r>
-        <w:rPr>
-          <w:rFonts w:ascii="Segoe UI" w:hAnsi="Segoe UI" w:cs="Segoe UI"/>
-          <w:color w:val="0000CC"/>
-          <w:sz w:val="24"/>
-          <w:szCs w:val="24"/>
-        </w:rPr>
-        <w:t>String t, int r)</w:t>
+        <w:t>method map(String t, int r)</w:t>
       </w:r>
     </w:p>
     <w:p>
@@ -616,27 +556,7 @@
           <w:szCs w:val="24"/>
         </w:rPr>
         <w:tab/>
-        <w:t>H{t</w:t>
-      </w:r>
-      <w:proofErr w:type="gramStart"/>
-      <w:r>
-        <w:rPr>
-          <w:rFonts w:ascii="Segoe UI" w:hAnsi="Segoe UI" w:cs="Segoe UI"/>
-          <w:color w:val="0000CC"/>
-          <w:sz w:val="24"/>
-          <w:szCs w:val="24"/>
-        </w:rPr>
-        <w:t>}.sum</w:t>
-      </w:r>
-      <w:proofErr w:type="gramEnd"/>
-      <w:r>
-        <w:rPr>
-          <w:rFonts w:ascii="Segoe UI" w:hAnsi="Segoe UI" w:cs="Segoe UI"/>
-          <w:color w:val="0000CC"/>
-          <w:sz w:val="24"/>
-          <w:szCs w:val="24"/>
-        </w:rPr>
-        <w:t xml:space="preserve"> &lt;- r</w:t>
+        <w:t>H{t}.sum &lt;- r</w:t>
       </w:r>
     </w:p>
     <w:p>
@@ -679,9 +599,9 @@
           <w:szCs w:val="24"/>
         </w:rPr>
         <w:tab/>
-        <w:t>H{t</w:t>
-      </w:r>
-      <w:proofErr w:type="gramStart"/>
+        <w:t>H{t}.</w:t>
+      </w:r>
+      <w:proofErr w:type="spellStart"/>
       <w:r>
         <w:rPr>
           <w:rFonts w:ascii="Segoe UI" w:hAnsi="Segoe UI" w:cs="Segoe UI"/>
@@ -689,20 +609,9 @@
           <w:sz w:val="24"/>
           <w:szCs w:val="24"/>
         </w:rPr>
-        <w:t>}.</w:t>
-      </w:r>
-      <w:proofErr w:type="spellStart"/>
-      <w:r>
-        <w:rPr>
-          <w:rFonts w:ascii="Segoe UI" w:hAnsi="Segoe UI" w:cs="Segoe UI"/>
-          <w:color w:val="0000CC"/>
-          <w:sz w:val="24"/>
-          <w:szCs w:val="24"/>
-        </w:rPr>
         <w:t>cnt</w:t>
       </w:r>
       <w:proofErr w:type="spellEnd"/>
-      <w:proofErr w:type="gramEnd"/>
       <w:r>
         <w:rPr>
           <w:rFonts w:ascii="Segoe UI" w:hAnsi="Segoe UI" w:cs="Segoe UI"/>
@@ -787,9 +696,8 @@
           <w:szCs w:val="24"/>
         </w:rPr>
         <w:tab/>
-        <w:t>H{t</w:t>
-      </w:r>
-      <w:proofErr w:type="gramStart"/>
+        <w:t>H{t}.sum &lt;- H{t}</w:t>
+      </w:r>
       <w:r>
         <w:rPr>
           <w:rFonts w:ascii="Segoe UI" w:hAnsi="Segoe UI" w:cs="Segoe UI"/>
@@ -797,9 +705,8 @@
           <w:sz w:val="24"/>
           <w:szCs w:val="24"/>
         </w:rPr>
-        <w:t>}.sum</w:t>
-      </w:r>
-      <w:proofErr w:type="gramEnd"/>
+        <w:t>.sum</w:t>
+      </w:r>
       <w:r>
         <w:rPr>
           <w:rFonts w:ascii="Segoe UI" w:hAnsi="Segoe UI" w:cs="Segoe UI"/>
@@ -807,7 +714,7 @@
           <w:sz w:val="24"/>
           <w:szCs w:val="24"/>
         </w:rPr>
-        <w:t xml:space="preserve"> &lt;- H{t} + r</w:t>
+        <w:t xml:space="preserve"> + r</w:t>
       </w:r>
     </w:p>
     <w:p>
@@ -850,9 +757,9 @@
           <w:szCs w:val="24"/>
         </w:rPr>
         <w:tab/>
-        <w:t>H{t</w:t>
-      </w:r>
-      <w:proofErr w:type="gramStart"/>
+        <w:t>H{t}.</w:t>
+      </w:r>
+      <w:proofErr w:type="spellStart"/>
       <w:r>
         <w:rPr>
           <w:rFonts w:ascii="Segoe UI" w:hAnsi="Segoe UI" w:cs="Segoe UI"/>
@@ -860,7 +767,26 @@
           <w:sz w:val="24"/>
           <w:szCs w:val="24"/>
         </w:rPr>
-        <w:t>}.</w:t>
+        <w:t>cnt</w:t>
+      </w:r>
+      <w:proofErr w:type="spellEnd"/>
+      <w:r>
+        <w:rPr>
+          <w:rFonts w:ascii="Segoe UI" w:hAnsi="Segoe UI" w:cs="Segoe UI"/>
+          <w:color w:val="0000CC"/>
+          <w:sz w:val="24"/>
+          <w:szCs w:val="24"/>
+        </w:rPr>
+        <w:t xml:space="preserve"> &lt;- H{t}</w:t>
+      </w:r>
+      <w:r>
+        <w:rPr>
+          <w:rFonts w:ascii="Segoe UI" w:hAnsi="Segoe UI" w:cs="Segoe UI"/>
+          <w:color w:val="0000CC"/>
+          <w:sz w:val="24"/>
+          <w:szCs w:val="24"/>
+        </w:rPr>
+        <w:t>.</w:t>
       </w:r>
       <w:proofErr w:type="spellStart"/>
       <w:r>
@@ -873,7 +799,6 @@
         <w:t>cnt</w:t>
       </w:r>
       <w:proofErr w:type="spellEnd"/>
-      <w:proofErr w:type="gramEnd"/>
       <w:r>
         <w:rPr>
           <w:rFonts w:ascii="Segoe UI" w:hAnsi="Segoe UI" w:cs="Segoe UI"/>
@@ -881,7 +806,7 @@
           <w:sz w:val="24"/>
           <w:szCs w:val="24"/>
         </w:rPr>
-        <w:t xml:space="preserve"> &lt;- H{t} + 1</w:t>
+        <w:t xml:space="preserve"> + 1</w:t>
       </w:r>
     </w:p>
     <w:p>
@@ -906,27 +831,7 @@
           <w:szCs w:val="24"/>
         </w:rPr>
         <w:tab/>
-        <w:t xml:space="preserve">method </w:t>
-      </w:r>
-      <w:proofErr w:type="gramStart"/>
-      <w:r>
-        <w:rPr>
-          <w:rFonts w:ascii="Segoe UI" w:hAnsi="Segoe UI" w:cs="Segoe UI"/>
-          <w:color w:val="0000CC"/>
-          <w:sz w:val="24"/>
-          <w:szCs w:val="24"/>
-        </w:rPr>
-        <w:t>cleanup(</w:t>
-      </w:r>
-      <w:proofErr w:type="gramEnd"/>
-      <w:r>
-        <w:rPr>
-          <w:rFonts w:ascii="Segoe UI" w:hAnsi="Segoe UI" w:cs="Segoe UI"/>
-          <w:color w:val="0000CC"/>
-          <w:sz w:val="24"/>
-          <w:szCs w:val="24"/>
-        </w:rPr>
-        <w:t>):</w:t>
+        <w:t>method cleanup():</w:t>
       </w:r>
     </w:p>
     <w:p>
@@ -1003,8 +908,9 @@
           <w:szCs w:val="24"/>
         </w:rPr>
         <w:tab/>
-      </w:r>
-      <w:proofErr w:type="gramStart"/>
+        <w:t>Emit(t, (H{t}.sum, H{t}.</w:t>
+      </w:r>
+      <w:proofErr w:type="spellStart"/>
       <w:r>
         <w:rPr>
           <w:rFonts w:ascii="Segoe UI" w:hAnsi="Segoe UI" w:cs="Segoe UI"/>
@@ -1012,60 +918,9 @@
           <w:sz w:val="24"/>
           <w:szCs w:val="24"/>
         </w:rPr>
-        <w:t>Emit(</w:t>
-      </w:r>
-      <w:proofErr w:type="gramEnd"/>
-      <w:r>
-        <w:rPr>
-          <w:rFonts w:ascii="Segoe UI" w:hAnsi="Segoe UI" w:cs="Segoe UI"/>
-          <w:color w:val="0000CC"/>
-          <w:sz w:val="24"/>
-          <w:szCs w:val="24"/>
-        </w:rPr>
-        <w:t>t, (H{t</w:t>
-      </w:r>
-      <w:proofErr w:type="gramStart"/>
-      <w:r>
-        <w:rPr>
-          <w:rFonts w:ascii="Segoe UI" w:hAnsi="Segoe UI" w:cs="Segoe UI"/>
-          <w:color w:val="0000CC"/>
-          <w:sz w:val="24"/>
-          <w:szCs w:val="24"/>
-        </w:rPr>
-        <w:t>}.sum</w:t>
-      </w:r>
-      <w:proofErr w:type="gramEnd"/>
-      <w:r>
-        <w:rPr>
-          <w:rFonts w:ascii="Segoe UI" w:hAnsi="Segoe UI" w:cs="Segoe UI"/>
-          <w:color w:val="0000CC"/>
-          <w:sz w:val="24"/>
-          <w:szCs w:val="24"/>
-        </w:rPr>
-        <w:t>, H{t</w:t>
-      </w:r>
-      <w:proofErr w:type="gramStart"/>
-      <w:r>
-        <w:rPr>
-          <w:rFonts w:ascii="Segoe UI" w:hAnsi="Segoe UI" w:cs="Segoe UI"/>
-          <w:color w:val="0000CC"/>
-          <w:sz w:val="24"/>
-          <w:szCs w:val="24"/>
-        </w:rPr>
-        <w:t>}.</w:t>
-      </w:r>
-      <w:proofErr w:type="spellStart"/>
-      <w:r>
-        <w:rPr>
-          <w:rFonts w:ascii="Segoe UI" w:hAnsi="Segoe UI" w:cs="Segoe UI"/>
-          <w:color w:val="0000CC"/>
-          <w:sz w:val="24"/>
-          <w:szCs w:val="24"/>
-        </w:rPr>
         <w:t>cnt</w:t>
       </w:r>
       <w:proofErr w:type="spellEnd"/>
-      <w:proofErr w:type="gramEnd"/>
       <w:r>
         <w:rPr>
           <w:rFonts w:ascii="Segoe UI" w:hAnsi="Segoe UI" w:cs="Segoe UI"/>
@@ -1155,47 +1010,7 @@
           <w:szCs w:val="24"/>
         </w:rPr>
         <w:tab/>
-        <w:t xml:space="preserve">method </w:t>
-      </w:r>
-      <w:proofErr w:type="gramStart"/>
-      <w:r>
-        <w:rPr>
-          <w:rFonts w:ascii="Segoe UI" w:hAnsi="Segoe UI" w:cs="Segoe UI"/>
-          <w:color w:val="0000CC"/>
-          <w:sz w:val="24"/>
-          <w:szCs w:val="24"/>
-        </w:rPr>
-        <w:t>reduce(</w:t>
-      </w:r>
-      <w:proofErr w:type="gramEnd"/>
-      <w:r>
-        <w:rPr>
-          <w:rFonts w:ascii="Segoe UI" w:hAnsi="Segoe UI" w:cs="Segoe UI"/>
-          <w:color w:val="0000CC"/>
-          <w:sz w:val="24"/>
-          <w:szCs w:val="24"/>
-        </w:rPr>
-        <w:t xml:space="preserve">String t, </w:t>
-      </w:r>
-      <w:proofErr w:type="gramStart"/>
-      <w:r>
-        <w:rPr>
-          <w:rFonts w:ascii="Segoe UI" w:hAnsi="Segoe UI" w:cs="Segoe UI"/>
-          <w:color w:val="0000CC"/>
-          <w:sz w:val="24"/>
-          <w:szCs w:val="24"/>
-        </w:rPr>
-        <w:t>pairs[</w:t>
-      </w:r>
-      <w:proofErr w:type="gramEnd"/>
-      <w:r>
-        <w:rPr>
-          <w:rFonts w:ascii="Segoe UI" w:hAnsi="Segoe UI" w:cs="Segoe UI"/>
-          <w:color w:val="0000CC"/>
-          <w:sz w:val="24"/>
-          <w:szCs w:val="24"/>
-        </w:rPr>
-        <w:t>(s1, c1), (s2, c2), …])</w:t>
+        <w:t>method reduce(String t, pairs[(s1, c1), (s2, c2), …])</w:t>
       </w:r>
     </w:p>
     <w:p>
@@ -1317,7 +1132,43 @@
           <w:szCs w:val="24"/>
         </w:rPr>
         <w:tab/>
-        <w:t>for all pair (s, c) in pairs [(s1, c1), (s2, c2), …]) do:</w:t>
+        <w:t xml:space="preserve">for </w:t>
+      </w:r>
+      <w:r>
+        <w:rPr>
+          <w:rFonts w:ascii="Segoe UI" w:hAnsi="Segoe UI" w:cs="Segoe UI"/>
+          <w:color w:val="0000CC"/>
+          <w:sz w:val="24"/>
+          <w:szCs w:val="24"/>
+        </w:rPr>
+        <w:t>each</w:t>
+      </w:r>
+      <w:r>
+        <w:rPr>
+          <w:rFonts w:ascii="Segoe UI" w:hAnsi="Segoe UI" w:cs="Segoe UI"/>
+          <w:color w:val="0000CC"/>
+          <w:sz w:val="24"/>
+          <w:szCs w:val="24"/>
+        </w:rPr>
+        <w:t xml:space="preserve"> pair</w:t>
+      </w:r>
+      <w:r>
+        <w:rPr>
+          <w:rFonts w:ascii="Segoe UI" w:hAnsi="Segoe UI" w:cs="Segoe UI"/>
+          <w:color w:val="0000CC"/>
+          <w:sz w:val="24"/>
+          <w:szCs w:val="24"/>
+        </w:rPr>
+        <w:t xml:space="preserve"> in pairs</w:t>
+      </w:r>
+      <w:r>
+        <w:rPr>
+          <w:rFonts w:ascii="Segoe UI" w:hAnsi="Segoe UI" w:cs="Segoe UI"/>
+          <w:color w:val="0000CC"/>
+          <w:sz w:val="24"/>
+          <w:szCs w:val="24"/>
+        </w:rPr>
+        <w:t xml:space="preserve"> do:</w:t>
       </w:r>
     </w:p>
     <w:p>
@@ -1512,26 +1363,7 @@
           <w:szCs w:val="24"/>
         </w:rPr>
         <w:tab/>
-      </w:r>
-      <w:proofErr w:type="gramStart"/>
-      <w:r>
-        <w:rPr>
-          <w:rFonts w:ascii="Segoe UI" w:hAnsi="Segoe UI" w:cs="Segoe UI"/>
-          <w:color w:val="0000CC"/>
-          <w:sz w:val="24"/>
-          <w:szCs w:val="24"/>
-        </w:rPr>
-        <w:t>Emit(</w:t>
-      </w:r>
-      <w:proofErr w:type="gramEnd"/>
-      <w:r>
-        <w:rPr>
-          <w:rFonts w:ascii="Segoe UI" w:hAnsi="Segoe UI" w:cs="Segoe UI"/>
-          <w:color w:val="0000CC"/>
-          <w:sz w:val="24"/>
-          <w:szCs w:val="24"/>
-        </w:rPr>
-        <w:t>t, avg)</w:t>
+        <w:t>Emit(t, avg)</w:t>
       </w:r>
     </w:p>
     <w:p>
@@ -1692,25 +1524,7 @@
           <w:szCs w:val="24"/>
         </w:rPr>
         <w:br/>
-        <w:t xml:space="preserve">Further, let the partitioner assign all words starting from </w:t>
-      </w:r>
-      <w:proofErr w:type="gramStart"/>
-      <w:r>
-        <w:rPr>
-          <w:rFonts w:ascii="Segoe UI" w:hAnsi="Segoe UI" w:cs="Segoe UI"/>
-          <w:sz w:val="24"/>
-          <w:szCs w:val="24"/>
-        </w:rPr>
-        <w:t>letter ‘a-</w:t>
-      </w:r>
-      <w:proofErr w:type="gramEnd"/>
-      <w:r>
-        <w:rPr>
-          <w:rFonts w:ascii="Segoe UI" w:hAnsi="Segoe UI" w:cs="Segoe UI"/>
-          <w:sz w:val="24"/>
-          <w:szCs w:val="24"/>
-        </w:rPr>
-        <w:t>j’</w:t>
+        <w:t>Further, let the partitioner assign all words starting from letter ‘a-j’</w:t>
       </w:r>
       <w:r>
         <w:rPr>
@@ -1795,25 +1609,23 @@
           <w:sz w:val="24"/>
           <w:szCs w:val="24"/>
         </w:rPr>
-        <w:t>nput split</w:t>
-      </w:r>
-      <w:proofErr w:type="gramStart"/>
+        <w:t>nput split1 : [</w:t>
+      </w:r>
       <w:r>
         <w:rPr>
           <w:rFonts w:ascii="Cambria" w:hAnsi="Cambria"/>
           <w:sz w:val="24"/>
           <w:szCs w:val="24"/>
         </w:rPr>
-        <w:t>1 :</w:t>
-      </w:r>
-      <w:proofErr w:type="gramEnd"/>
+        <w:t>cherry</w:t>
+      </w:r>
       <w:r>
         <w:rPr>
           <w:rFonts w:ascii="Cambria" w:hAnsi="Cambria"/>
           <w:sz w:val="24"/>
           <w:szCs w:val="24"/>
         </w:rPr>
-        <w:t xml:space="preserve"> [</w:t>
+        <w:t xml:space="preserve"> </w:t>
       </w:r>
       <w:r>
         <w:rPr>
@@ -1821,6 +1633,22 @@
           <w:sz w:val="24"/>
           <w:szCs w:val="24"/>
         </w:rPr>
+        <w:t>mango</w:t>
+      </w:r>
+      <w:r>
+        <w:rPr>
+          <w:rFonts w:ascii="Cambria" w:hAnsi="Cambria"/>
+          <w:sz w:val="24"/>
+          <w:szCs w:val="24"/>
+        </w:rPr>
+        <w:t xml:space="preserve"> </w:t>
+      </w:r>
+      <w:r>
+        <w:rPr>
+          <w:rFonts w:ascii="Cambria" w:hAnsi="Cambria"/>
+          <w:sz w:val="24"/>
+          <w:szCs w:val="24"/>
+        </w:rPr>
         <w:t>cherry</w:t>
       </w:r>
       <w:r>
@@ -1829,7 +1657,7 @@
           <w:sz w:val="24"/>
           <w:szCs w:val="24"/>
         </w:rPr>
-        <w:t xml:space="preserve"> </w:t>
+        <w:t>]</w:t>
       </w:r>
       <w:r>
         <w:rPr>
@@ -1837,7 +1665,8 @@
           <w:sz w:val="24"/>
           <w:szCs w:val="24"/>
         </w:rPr>
-        <w:t>mango</w:t>
+        <w:br/>
+        <w:t xml:space="preserve">                          </w:t>
       </w:r>
       <w:r>
         <w:rPr>
@@ -1845,51 +1674,8 @@
           <w:sz w:val="24"/>
           <w:szCs w:val="24"/>
         </w:rPr>
-        <w:t xml:space="preserve"> </w:t>
-      </w:r>
-      <w:r>
-        <w:rPr>
-          <w:rFonts w:ascii="Cambria" w:hAnsi="Cambria"/>
-          <w:sz w:val="24"/>
-          <w:szCs w:val="24"/>
-        </w:rPr>
-        <w:t>cherry</w:t>
-      </w:r>
-      <w:r>
-        <w:rPr>
-          <w:rFonts w:ascii="Cambria" w:hAnsi="Cambria"/>
-          <w:sz w:val="24"/>
-          <w:szCs w:val="24"/>
-        </w:rPr>
-        <w:t>]</w:t>
-      </w:r>
-      <w:r>
-        <w:rPr>
-          <w:rFonts w:ascii="Cambria" w:hAnsi="Cambria"/>
-          <w:sz w:val="24"/>
-          <w:szCs w:val="24"/>
-        </w:rPr>
-        <w:br/>
-        <w:t xml:space="preserve">                       </w:t>
-      </w:r>
-      <w:proofErr w:type="gramStart"/>
-      <w:r>
-        <w:rPr>
-          <w:rFonts w:ascii="Cambria" w:hAnsi="Cambria"/>
-          <w:sz w:val="24"/>
-          <w:szCs w:val="24"/>
-        </w:rPr>
-        <w:t xml:space="preserve">   </w:t>
-      </w:r>
-      <w:r>
-        <w:rPr>
-          <w:rFonts w:ascii="Cambria" w:hAnsi="Cambria"/>
-          <w:sz w:val="24"/>
-          <w:szCs w:val="24"/>
-        </w:rPr>
         <w:t>[</w:t>
       </w:r>
-      <w:proofErr w:type="gramEnd"/>
       <w:r>
         <w:rPr>
           <w:rFonts w:ascii="Cambria" w:hAnsi="Cambria"/>
@@ -1979,33 +1765,15 @@
           <w:sz w:val="24"/>
           <w:szCs w:val="24"/>
         </w:rPr>
-        <w:t>nput split</w:t>
-      </w:r>
-      <w:proofErr w:type="gramStart"/>
+        <w:t>nput split2</w:t>
+      </w:r>
       <w:r>
         <w:rPr>
           <w:rFonts w:ascii="Cambria" w:hAnsi="Cambria"/>
           <w:sz w:val="24"/>
           <w:szCs w:val="24"/>
         </w:rPr>
-        <w:t>2</w:t>
-      </w:r>
-      <w:r>
-        <w:rPr>
-          <w:rFonts w:ascii="Cambria" w:hAnsi="Cambria"/>
-          <w:sz w:val="24"/>
-          <w:szCs w:val="24"/>
-        </w:rPr>
-        <w:t xml:space="preserve"> :</w:t>
-      </w:r>
-      <w:proofErr w:type="gramEnd"/>
-      <w:r>
-        <w:rPr>
-          <w:rFonts w:ascii="Cambria" w:hAnsi="Cambria"/>
-          <w:sz w:val="24"/>
-          <w:szCs w:val="24"/>
-        </w:rPr>
-        <w:t xml:space="preserve"> [</w:t>
+        <w:t xml:space="preserve"> : [</w:t>
       </w:r>
       <w:r>
         <w:rPr>
@@ -2200,33 +1968,15 @@
           <w:sz w:val="24"/>
           <w:szCs w:val="24"/>
         </w:rPr>
-        <w:t>nput split</w:t>
-      </w:r>
-      <w:proofErr w:type="gramStart"/>
+        <w:t>nput split3</w:t>
+      </w:r>
       <w:r>
         <w:rPr>
           <w:rFonts w:ascii="Cambria" w:hAnsi="Cambria"/>
           <w:sz w:val="24"/>
           <w:szCs w:val="24"/>
         </w:rPr>
-        <w:t>3</w:t>
-      </w:r>
-      <w:r>
-        <w:rPr>
-          <w:rFonts w:ascii="Cambria" w:hAnsi="Cambria"/>
-          <w:sz w:val="24"/>
-          <w:szCs w:val="24"/>
-        </w:rPr>
-        <w:t xml:space="preserve"> :</w:t>
-      </w:r>
-      <w:proofErr w:type="gramEnd"/>
-      <w:r>
-        <w:rPr>
-          <w:rFonts w:ascii="Cambria" w:hAnsi="Cambria"/>
-          <w:sz w:val="24"/>
-          <w:szCs w:val="24"/>
-        </w:rPr>
-        <w:t xml:space="preserve"> [</w:t>
+        <w:t xml:space="preserve"> : [</w:t>
       </w:r>
       <w:r>
         <w:rPr>
@@ -2421,60 +2171,24 @@
           <w:sz w:val="24"/>
           <w:szCs w:val="24"/>
         </w:rPr>
-        <w:t>Input split</w:t>
-      </w:r>
-      <w:proofErr w:type="gramStart"/>
+        <w:t>Input split4 : [mango carrot plum]</w:t>
+      </w:r>
       <w:r>
         <w:rPr>
           <w:rFonts w:ascii="Cambria" w:hAnsi="Cambria"/>
           <w:sz w:val="24"/>
           <w:szCs w:val="24"/>
         </w:rPr>
-        <w:t>4 :</w:t>
-      </w:r>
-      <w:proofErr w:type="gramEnd"/>
+        <w:br/>
+        <w:t xml:space="preserve">                          </w:t>
+      </w:r>
       <w:r>
         <w:rPr>
           <w:rFonts w:ascii="Cambria" w:hAnsi="Cambria"/>
           <w:sz w:val="24"/>
           <w:szCs w:val="24"/>
         </w:rPr>
-        <w:t xml:space="preserve"> [mango carrot plum]</w:t>
-      </w:r>
-      <w:r>
-        <w:rPr>
-          <w:rFonts w:ascii="Cambria" w:hAnsi="Cambria"/>
-          <w:sz w:val="24"/>
-          <w:szCs w:val="24"/>
-        </w:rPr>
-        <w:br/>
-        <w:t xml:space="preserve">                       </w:t>
-      </w:r>
-      <w:proofErr w:type="gramStart"/>
-      <w:r>
-        <w:rPr>
-          <w:rFonts w:ascii="Cambria" w:hAnsi="Cambria"/>
-          <w:sz w:val="24"/>
-          <w:szCs w:val="24"/>
-        </w:rPr>
-        <w:t xml:space="preserve">   </w:t>
-      </w:r>
-      <w:r>
-        <w:rPr>
-          <w:rFonts w:ascii="Cambria" w:hAnsi="Cambria"/>
-          <w:sz w:val="24"/>
-          <w:szCs w:val="24"/>
-        </w:rPr>
-        <w:t>[</w:t>
-      </w:r>
-      <w:proofErr w:type="gramEnd"/>
-      <w:r>
-        <w:rPr>
-          <w:rFonts w:ascii="Cambria" w:hAnsi="Cambria"/>
-          <w:sz w:val="24"/>
-          <w:szCs w:val="24"/>
-        </w:rPr>
-        <w:t>radish kiwi banana]</w:t>
+        <w:t>[radish kiwi banana]</w:t>
       </w:r>
     </w:p>
     <w:p>
@@ -2493,25 +2207,7 @@
           <w:sz w:val="24"/>
           <w:szCs w:val="24"/>
         </w:rPr>
-        <w:t xml:space="preserve"> Input split</w:t>
-      </w:r>
-      <w:proofErr w:type="gramStart"/>
-      <w:r>
-        <w:rPr>
-          <w:rFonts w:ascii="Cambria" w:hAnsi="Cambria"/>
-          <w:sz w:val="24"/>
-          <w:szCs w:val="24"/>
-        </w:rPr>
-        <w:t>5 :</w:t>
-      </w:r>
-      <w:proofErr w:type="gramEnd"/>
-      <w:r>
-        <w:rPr>
-          <w:rFonts w:ascii="Cambria" w:hAnsi="Cambria"/>
-          <w:sz w:val="24"/>
-          <w:szCs w:val="24"/>
-        </w:rPr>
-        <w:t xml:space="preserve"> [banana radish kiwi]</w:t>
+        <w:t xml:space="preserve"> Input split5 : [banana radish kiwi]</w:t>
       </w:r>
       <w:r>
         <w:rPr>
@@ -2563,25 +2259,7 @@
           <w:sz w:val="24"/>
           <w:szCs w:val="24"/>
         </w:rPr>
-        <w:t xml:space="preserve"> Input split</w:t>
-      </w:r>
-      <w:proofErr w:type="gramStart"/>
-      <w:r>
-        <w:rPr>
-          <w:rFonts w:ascii="Cambria" w:hAnsi="Cambria"/>
-          <w:sz w:val="24"/>
-          <w:szCs w:val="24"/>
-        </w:rPr>
-        <w:t>6 :</w:t>
-      </w:r>
-      <w:proofErr w:type="gramEnd"/>
-      <w:r>
-        <w:rPr>
-          <w:rFonts w:ascii="Cambria" w:hAnsi="Cambria"/>
-          <w:sz w:val="24"/>
-          <w:szCs w:val="24"/>
-        </w:rPr>
-        <w:t xml:space="preserve"> [banana radish plum banana]</w:t>
+        <w:t xml:space="preserve"> Input split6 : [banana radish plum banana]</w:t>
       </w:r>
       <w:r>
         <w:rPr>
@@ -2868,33 +2546,15 @@
           <w:sz w:val="24"/>
           <w:szCs w:val="24"/>
         </w:rPr>
-        <w:t xml:space="preserve">Illustrate the word count algorithm </w:t>
-      </w:r>
-      <w:proofErr w:type="gramStart"/>
-      <w:r>
-        <w:rPr>
-          <w:rFonts w:ascii="Segoe UI" w:hAnsi="Segoe UI" w:cs="Segoe UI"/>
-          <w:sz w:val="24"/>
-          <w:szCs w:val="24"/>
-        </w:rPr>
-        <w:t xml:space="preserve">with </w:t>
-      </w:r>
-      <w:r>
-        <w:rPr>
-          <w:rFonts w:ascii="Segoe UI" w:hAnsi="Segoe UI" w:cs="Segoe UI"/>
-          <w:sz w:val="24"/>
-          <w:szCs w:val="24"/>
-        </w:rPr>
-        <w:t>in</w:t>
-      </w:r>
-      <w:proofErr w:type="gramEnd"/>
-      <w:r>
-        <w:rPr>
-          <w:rFonts w:ascii="Segoe UI" w:hAnsi="Segoe UI" w:cs="Segoe UI"/>
-          <w:sz w:val="24"/>
-          <w:szCs w:val="24"/>
-        </w:rPr>
-        <w:t xml:space="preserve"> mapper </w:t>
+        <w:t xml:space="preserve">Illustrate the word count algorithm with </w:t>
+      </w:r>
+      <w:r>
+        <w:rPr>
+          <w:rFonts w:ascii="Segoe UI" w:hAnsi="Segoe UI" w:cs="Segoe UI"/>
+          <w:sz w:val="24"/>
+          <w:szCs w:val="24"/>
+        </w:rPr>
+        <w:t xml:space="preserve">in mapper </w:t>
       </w:r>
       <w:r>
         <w:rPr>
@@ -2919,27 +2579,7 @@
           <w:sz w:val="24"/>
           <w:szCs w:val="24"/>
         </w:rPr>
-        <w:t>show mapper o/</w:t>
-      </w:r>
-      <w:proofErr w:type="gramStart"/>
-      <w:r>
-        <w:rPr>
-          <w:rFonts w:ascii="Segoe UI" w:hAnsi="Segoe UI" w:cs="Segoe UI"/>
-          <w:i/>
-          <w:sz w:val="24"/>
-          <w:szCs w:val="24"/>
-        </w:rPr>
-        <w:t>p,  reducer</w:t>
-      </w:r>
-      <w:proofErr w:type="gramEnd"/>
-      <w:r>
-        <w:rPr>
-          <w:rFonts w:ascii="Segoe UI" w:hAnsi="Segoe UI" w:cs="Segoe UI"/>
-          <w:i/>
-          <w:sz w:val="24"/>
-          <w:szCs w:val="24"/>
-        </w:rPr>
-        <w:t xml:space="preserve"> </w:t>
+        <w:t xml:space="preserve">show mapper o/p,  reducer </w:t>
       </w:r>
       <w:proofErr w:type="spellStart"/>
       <w:r>
@@ -7402,7 +7042,6 @@
               </w:rPr>
               <w:t xml:space="preserve">, </w:t>
             </w:r>
-            <w:proofErr w:type="gramStart"/>
             <w:r>
               <w:rPr>
                 <w:rFonts w:asciiTheme="majorHAnsi" w:hAnsiTheme="majorHAnsi"/>
@@ -7432,7 +7071,6 @@
               </w:rPr>
               <w:t>2</w:t>
             </w:r>
-            <w:proofErr w:type="gramEnd"/>
             <w:r>
               <w:rPr>
                 <w:rFonts w:asciiTheme="majorHAnsi" w:hAnsiTheme="majorHAnsi"/>
@@ -7681,17 +7319,7 @@
                 <w:sz w:val="24"/>
                 <w:szCs w:val="24"/>
               </w:rPr>
-              <w:t xml:space="preserve">&lt;plum, </w:t>
-            </w:r>
-            <w:proofErr w:type="gramStart"/>
-            <w:r>
-              <w:rPr>
-                <w:rFonts w:asciiTheme="majorHAnsi" w:hAnsiTheme="majorHAnsi"/>
-                <w:color w:val="0000CC"/>
-                <w:sz w:val="24"/>
-                <w:szCs w:val="24"/>
-              </w:rPr>
-              <w:t>[</w:t>
+              <w:t>&lt;plum, [</w:t>
             </w:r>
             <w:r>
               <w:rPr>
@@ -7712,7 +7340,6 @@
               </w:rPr>
               <w:t xml:space="preserve">, </w:t>
             </w:r>
-            <w:proofErr w:type="gramEnd"/>
             <w:r>
               <w:rPr>
                 <w:rFonts w:asciiTheme="majorHAnsi" w:hAnsiTheme="majorHAnsi"/>
@@ -7945,7 +7572,6 @@
           <w:szCs w:val="24"/>
         </w:rPr>
       </w:pPr>
-      <w:proofErr w:type="gramStart"/>
       <w:r>
         <w:rPr>
           <w:rFonts w:asciiTheme="majorHAnsi" w:hAnsiTheme="majorHAnsi"/>
@@ -7953,17 +7579,7 @@
           <w:sz w:val="24"/>
           <w:szCs w:val="24"/>
         </w:rPr>
-        <w:t>Reducer</w:t>
-      </w:r>
-      <w:proofErr w:type="gramEnd"/>
-      <w:r>
-        <w:rPr>
-          <w:rFonts w:asciiTheme="majorHAnsi" w:hAnsiTheme="majorHAnsi"/>
-          <w:color w:val="0000CC"/>
-          <w:sz w:val="24"/>
-          <w:szCs w:val="24"/>
-        </w:rPr>
-        <w:t xml:space="preserve"> output is the same for </w:t>
+        <w:t xml:space="preserve">Reducer output is the same for </w:t>
       </w:r>
       <w:r>
         <w:rPr>

</xml_diff>